<commit_message>
Update README and documentation
</commit_message>
<xml_diff>
--- a/docs/phase1/Kafka_Phase1_documentation.docx
+++ b/docs/phase1/Kafka_Phase1_documentation.docx
@@ -280,6 +280,8 @@
               </mc:Fallback>
             </mc:AlternateContent>
           </w:r>
+        </w:p>
+        <w:p>
           <w:r>
             <w:rPr>
               <w:noProof/>
@@ -287,23 +289,14 @@
             <mc:AlternateContent>
               <mc:Choice Requires="wps">
                 <w:drawing>
-                  <wp:anchor distT="0" distB="0" distL="114300" distR="114300" simplePos="0" relativeHeight="251660288" behindDoc="0" locked="0" layoutInCell="1" allowOverlap="1" wp14:anchorId="39F03253" wp14:editId="4EC75C3D">
+                  <wp:anchor distT="0" distB="0" distL="114300" distR="114300" simplePos="0" relativeHeight="251660288" behindDoc="0" locked="0" layoutInCell="1" allowOverlap="1" wp14:anchorId="39F03253" wp14:editId="19528424">
                     <wp:simplePos x="0" y="0"/>
                     <wp:positionH relativeFrom="page">
-                      <wp:align>center</wp:align>
+                      <wp:posOffset>413385</wp:posOffset>
                     </wp:positionH>
-                    <mc:AlternateContent>
-                      <mc:Choice Requires="wp14">
-                        <wp:positionV relativeFrom="page">
-                          <wp14:pctPosVOffset>81800</wp14:pctPosVOffset>
-                        </wp:positionV>
-                      </mc:Choice>
-                      <mc:Fallback>
-                        <wp:positionV relativeFrom="page">
-                          <wp:posOffset>8745855</wp:posOffset>
-                        </wp:positionV>
-                      </mc:Fallback>
-                    </mc:AlternateContent>
+                    <wp:positionV relativeFrom="page">
+                      <wp:posOffset>7793355</wp:posOffset>
+                    </wp:positionV>
                     <wp:extent cx="7315200" cy="914400"/>
                     <wp:effectExtent l="0" t="0" r="0" b="8255"/>
                     <wp:wrapSquare wrapText="bothSides"/>
@@ -440,7 +433,7 @@
                     <v:stroke joinstyle="miter"/>
                     <v:path gradientshapeok="t" o:connecttype="rect"/>
                   </v:shapetype>
-                  <v:shape id="Text Box 159" o:spid="_x0000_s1026" type="#_x0000_t202" style="position:absolute;margin-left:0;margin-top:0;width:8in;height:1in;z-index:251660288;visibility:visible;mso-wrap-style:square;mso-width-percent:941;mso-height-percent:92;mso-top-percent:818;mso-wrap-distance-left:9pt;mso-wrap-distance-top:0;mso-wrap-distance-right:9pt;mso-wrap-distance-bottom:0;mso-position-horizontal:center;mso-position-horizontal-relative:page;mso-position-vertical-relative:page;mso-width-percent:941;mso-height-percent:92;mso-top-percent:818;mso-width-relative:page;mso-height-relative:page;v-text-anchor:bottom" o:gfxdata="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" filled="f" stroked="f" strokeweight=".5pt">
+                  <v:shape id="Text Box 159" o:spid="_x0000_s1026" type="#_x0000_t202" style="position:absolute;margin-left:32.55pt;margin-top:613.65pt;width:8in;height:1in;z-index:251660288;visibility:visible;mso-wrap-style:square;mso-width-percent:941;mso-height-percent:92;mso-wrap-distance-left:9pt;mso-wrap-distance-top:0;mso-wrap-distance-right:9pt;mso-wrap-distance-bottom:0;mso-position-horizontal:absolute;mso-position-horizontal-relative:page;mso-position-vertical:absolute;mso-position-vertical-relative:page;mso-width-percent:941;mso-height-percent:92;mso-width-relative:page;mso-height-relative:page;v-text-anchor:bottom" o:gfxdata="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" filled="f" stroked="f" strokeweight=".5pt">
                     <v:textbox inset="126pt,0,54pt,0">
                       <w:txbxContent>
                         <w:sdt>
@@ -529,25 +522,165 @@
             <mc:AlternateContent>
               <mc:Choice Requires="wps">
                 <w:drawing>
-                  <wp:anchor distT="0" distB="0" distL="114300" distR="114300" simplePos="0" relativeHeight="251659264" behindDoc="0" locked="0" layoutInCell="1" allowOverlap="1" wp14:anchorId="1F8B9F49" wp14:editId="4F6D852D">
+                  <wp:anchor distT="0" distB="0" distL="114300" distR="114300" simplePos="0" relativeHeight="251661312" behindDoc="0" locked="0" layoutInCell="1" allowOverlap="1" wp14:anchorId="512A71F1" wp14:editId="2C94EC05">
                     <wp:simplePos x="0" y="0"/>
                     <wp:positionH relativeFrom="page">
+                      <wp:posOffset>537210</wp:posOffset>
+                    </wp:positionH>
+                    <wp:positionV relativeFrom="page">
+                      <wp:posOffset>6290310</wp:posOffset>
+                    </wp:positionV>
+                    <wp:extent cx="6835140" cy="578485"/>
+                    <wp:effectExtent l="0" t="0" r="0" b="12065"/>
+                    <wp:wrapSquare wrapText="bothSides"/>
+                    <wp:docPr id="153" name="Text Box 161"/>
+                    <wp:cNvGraphicFramePr/>
+                    <a:graphic xmlns:a="http://schemas.openxmlformats.org/drawingml/2006/main">
+                      <a:graphicData uri="http://schemas.microsoft.com/office/word/2010/wordprocessingShape">
+                        <wps:wsp>
+                          <wps:cNvSpPr txBox="1"/>
+                          <wps:spPr>
+                            <a:xfrm>
+                              <a:off x="0" y="0"/>
+                              <a:ext cx="6835140" cy="578485"/>
+                            </a:xfrm>
+                            <a:prstGeom prst="rect">
+                              <a:avLst/>
+                            </a:prstGeom>
+                            <a:noFill/>
+                            <a:ln w="6350">
+                              <a:noFill/>
+                            </a:ln>
+                            <a:effectLst/>
+                          </wps:spPr>
+                          <wps:style>
+                            <a:lnRef idx="0">
+                              <a:schemeClr val="accent1"/>
+                            </a:lnRef>
+                            <a:fillRef idx="0">
+                              <a:schemeClr val="accent1"/>
+                            </a:fillRef>
+                            <a:effectRef idx="0">
+                              <a:schemeClr val="accent1"/>
+                            </a:effectRef>
+                            <a:fontRef idx="minor">
+                              <a:schemeClr val="dk1"/>
+                            </a:fontRef>
+                          </wps:style>
+                          <wps:txbx>
+                            <w:txbxContent>
+                              <w:p>
+                                <w:pPr>
+                                  <w:pStyle w:val="NoSpacing"/>
+                                  <w:jc w:val="right"/>
+                                  <w:rPr>
+                                    <w:color w:val="595959" w:themeColor="text1" w:themeTint="A6"/>
+                                    <w:sz w:val="20"/>
+                                    <w:szCs w:val="20"/>
+                                  </w:rPr>
+                                </w:pPr>
+                                <w:r>
+                                  <w:rPr>
+                                    <w:rFonts w:cs="Times New Roman"/>
+                                    <w:b/>
+                                    <w:color w:val="2E5090"/>
+                                    <w:sz w:val="32"/>
+                                  </w:rPr>
+                                  <w:t>Document Version: 1.0 | Duration: 2-3 weeks | Difficulty: Intermediate</w:t>
+                                </w:r>
+                              </w:p>
+                              <w:p>
+                                <w:pPr>
+                                  <w:pStyle w:val="NoSpacing"/>
+                                  <w:jc w:val="right"/>
+                                  <w:rPr>
+                                    <w:color w:val="595959" w:themeColor="text1" w:themeTint="A6"/>
+                                    <w:sz w:val="20"/>
+                                    <w:szCs w:val="20"/>
+                                  </w:rPr>
+                                </w:pPr>
+                              </w:p>
+                            </w:txbxContent>
+                          </wps:txbx>
+                          <wps:bodyPr rot="0" spcFirstLastPara="0" vertOverflow="overflow" horzOverflow="overflow" vert="horz" wrap="square" lIns="1600200" tIns="0" rIns="685800" bIns="0" numCol="1" spcCol="0" rtlCol="0" fromWordArt="0" anchor="t" anchorCtr="0" forceAA="0" compatLnSpc="1">
+                            <a:prstTxWarp prst="textNoShape">
+                              <a:avLst/>
+                            </a:prstTxWarp>
+                            <a:noAutofit/>
+                          </wps:bodyPr>
+                        </wps:wsp>
+                      </a:graphicData>
+                    </a:graphic>
+                    <wp14:sizeRelH relativeFrom="page">
+                      <wp14:pctWidth>0</wp14:pctWidth>
+                    </wp14:sizeRelH>
+                    <wp14:sizeRelV relativeFrom="page">
+                      <wp14:pctHeight>0</wp14:pctHeight>
+                    </wp14:sizeRelV>
+                  </wp:anchor>
+                </w:drawing>
+              </mc:Choice>
+              <mc:Fallback>
+                <w:pict>
+                  <v:shape w14:anchorId="512A71F1" id="Text Box 161" o:spid="_x0000_s1027" type="#_x0000_t202" style="position:absolute;margin-left:42.3pt;margin-top:495.3pt;width:538.2pt;height:45.55pt;z-index:251661312;visibility:visible;mso-wrap-style:square;mso-width-percent:0;mso-height-percent:0;mso-wrap-distance-left:9pt;mso-wrap-distance-top:0;mso-wrap-distance-right:9pt;mso-wrap-distance-bottom:0;mso-position-horizontal:absolute;mso-position-horizontal-relative:page;mso-position-vertical:absolute;mso-position-vertical-relative:page;mso-width-percent:0;mso-height-percent:0;mso-width-relative:page;mso-height-relative:page;v-text-anchor:top" o:gfxdata="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" filled="f" stroked="f" strokeweight=".5pt">
+                    <v:textbox inset="126pt,0,54pt,0">
+                      <w:txbxContent>
+                        <w:p>
+                          <w:pPr>
+                            <w:pStyle w:val="NoSpacing"/>
+                            <w:jc w:val="right"/>
+                            <w:rPr>
+                              <w:color w:val="595959" w:themeColor="text1" w:themeTint="A6"/>
+                              <w:sz w:val="20"/>
+                              <w:szCs w:val="20"/>
+                            </w:rPr>
+                          </w:pPr>
+                          <w:r>
+                            <w:rPr>
+                              <w:rFonts w:cs="Times New Roman"/>
+                              <w:b/>
+                              <w:color w:val="2E5090"/>
+                              <w:sz w:val="32"/>
+                            </w:rPr>
+                            <w:t>Document Version: 1.0 | Duration: 2-3 weeks | Difficulty: Intermediate</w:t>
+                          </w:r>
+                        </w:p>
+                        <w:p>
+                          <w:pPr>
+                            <w:pStyle w:val="NoSpacing"/>
+                            <w:jc w:val="right"/>
+                            <w:rPr>
+                              <w:color w:val="595959" w:themeColor="text1" w:themeTint="A6"/>
+                              <w:sz w:val="20"/>
+                              <w:szCs w:val="20"/>
+                            </w:rPr>
+                          </w:pPr>
+                        </w:p>
+                      </w:txbxContent>
+                    </v:textbox>
+                    <w10:wrap type="square" anchorx="page" anchory="page"/>
+                  </v:shape>
+                </w:pict>
+              </mc:Fallback>
+            </mc:AlternateContent>
+          </w:r>
+          <w:r>
+            <w:rPr>
+              <w:noProof/>
+            </w:rPr>
+            <mc:AlternateContent>
+              <mc:Choice Requires="wps">
+                <w:drawing>
+                  <wp:anchor distT="0" distB="0" distL="114300" distR="114300" simplePos="0" relativeHeight="251659264" behindDoc="0" locked="0" layoutInCell="1" allowOverlap="1" wp14:anchorId="1F8B9F49" wp14:editId="21329B4A">
+                    <wp:simplePos x="0" y="0"/>
+                    <wp:positionH relativeFrom="margin">
                       <wp:align>center</wp:align>
                     </wp:positionH>
-                    <mc:AlternateContent>
-                      <mc:Choice Requires="wp14">
-                        <wp:positionV relativeFrom="page">
-                          <wp14:pctPosVOffset>30000</wp14:pctPosVOffset>
-                        </wp:positionV>
-                      </mc:Choice>
-                      <mc:Fallback>
-                        <wp:positionV relativeFrom="page">
-                          <wp:posOffset>3207385</wp:posOffset>
-                        </wp:positionV>
-                      </mc:Fallback>
-                    </mc:AlternateContent>
+                    <wp:positionV relativeFrom="page">
+                      <wp:posOffset>2026285</wp:posOffset>
+                    </wp:positionV>
                     <wp:extent cx="7315200" cy="3638550"/>
-                    <wp:effectExtent l="0" t="0" r="0" b="6350"/>
+                    <wp:effectExtent l="0" t="0" r="0" b="5080"/>
                     <wp:wrapSquare wrapText="bothSides"/>
                     <wp:docPr id="154" name="Text Box 163"/>
                     <wp:cNvGraphicFramePr/>
@@ -713,7 +846,7 @@
               </mc:Choice>
               <mc:Fallback>
                 <w:pict>
-                  <v:shape w14:anchorId="1F8B9F49" id="Text Box 163" o:spid="_x0000_s1027" type="#_x0000_t202" style="position:absolute;margin-left:0;margin-top:0;width:8in;height:286.5pt;z-index:251659264;visibility:visible;mso-wrap-style:square;mso-width-percent:941;mso-height-percent:363;mso-top-percent:300;mso-wrap-distance-left:9pt;mso-wrap-distance-top:0;mso-wrap-distance-right:9pt;mso-wrap-distance-bottom:0;mso-position-horizontal:center;mso-position-horizontal-relative:page;mso-position-vertical-relative:page;mso-width-percent:941;mso-height-percent:363;mso-top-percent:300;mso-width-relative:page;mso-height-relative:page;v-text-anchor:bottom" o:gfxdata="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" filled="f" stroked="f" strokeweight=".5pt">
+                  <v:shape w14:anchorId="1F8B9F49" id="Text Box 163" o:spid="_x0000_s1028" type="#_x0000_t202" style="position:absolute;margin-left:0;margin-top:159.55pt;width:8in;height:286.5pt;z-index:251659264;visibility:visible;mso-wrap-style:square;mso-width-percent:941;mso-height-percent:363;mso-wrap-distance-left:9pt;mso-wrap-distance-top:0;mso-wrap-distance-right:9pt;mso-wrap-distance-bottom:0;mso-position-horizontal:center;mso-position-horizontal-relative:margin;mso-position-vertical:absolute;mso-position-vertical-relative:page;mso-width-percent:941;mso-height-percent:363;mso-width-relative:page;mso-height-relative:page;v-text-anchor:bottom" o:gfxdata="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" filled="f" stroked="f" strokeweight=".5pt">
                     <v:textbox inset="126pt,0,54pt,0">
                       <w:txbxContent>
                         <w:p>
@@ -824,158 +957,7 @@
                         </w:sdt>
                       </w:txbxContent>
                     </v:textbox>
-                    <w10:wrap type="square" anchorx="page" anchory="page"/>
-                  </v:shape>
-                </w:pict>
-              </mc:Fallback>
-            </mc:AlternateContent>
-          </w:r>
-        </w:p>
-        <w:p>
-          <w:r>
-            <w:rPr>
-              <w:noProof/>
-            </w:rPr>
-            <mc:AlternateContent>
-              <mc:Choice Requires="wps">
-                <w:drawing>
-                  <wp:anchor distT="0" distB="0" distL="114300" distR="114300" simplePos="0" relativeHeight="251661312" behindDoc="0" locked="0" layoutInCell="1" allowOverlap="1" wp14:anchorId="512A71F1" wp14:editId="7DA2348E">
-                    <wp:simplePos x="0" y="0"/>
-                    <wp:positionH relativeFrom="page">
-                      <wp:posOffset>499533</wp:posOffset>
-                    </wp:positionH>
-                    <wp:positionV relativeFrom="page">
-                      <wp:posOffset>7408333</wp:posOffset>
-                    </wp:positionV>
-                    <wp:extent cx="6835140" cy="578485"/>
-                    <wp:effectExtent l="0" t="0" r="0" b="12065"/>
-                    <wp:wrapSquare wrapText="bothSides"/>
-                    <wp:docPr id="153" name="Text Box 161"/>
-                    <wp:cNvGraphicFramePr/>
-                    <a:graphic xmlns:a="http://schemas.openxmlformats.org/drawingml/2006/main">
-                      <a:graphicData uri="http://schemas.microsoft.com/office/word/2010/wordprocessingShape">
-                        <wps:wsp>
-                          <wps:cNvSpPr txBox="1"/>
-                          <wps:spPr>
-                            <a:xfrm>
-                              <a:off x="0" y="0"/>
-                              <a:ext cx="6835140" cy="578485"/>
-                            </a:xfrm>
-                            <a:prstGeom prst="rect">
-                              <a:avLst/>
-                            </a:prstGeom>
-                            <a:noFill/>
-                            <a:ln w="6350">
-                              <a:noFill/>
-                            </a:ln>
-                            <a:effectLst/>
-                          </wps:spPr>
-                          <wps:style>
-                            <a:lnRef idx="0">
-                              <a:schemeClr val="accent1"/>
-                            </a:lnRef>
-                            <a:fillRef idx="0">
-                              <a:schemeClr val="accent1"/>
-                            </a:fillRef>
-                            <a:effectRef idx="0">
-                              <a:schemeClr val="accent1"/>
-                            </a:effectRef>
-                            <a:fontRef idx="minor">
-                              <a:schemeClr val="dk1"/>
-                            </a:fontRef>
-                          </wps:style>
-                          <wps:txbx>
-                            <w:txbxContent>
-                              <w:p>
-                                <w:pPr>
-                                  <w:pStyle w:val="NoSpacing"/>
-                                  <w:jc w:val="right"/>
-                                  <w:rPr>
-                                    <w:color w:val="595959" w:themeColor="text1" w:themeTint="A6"/>
-                                    <w:sz w:val="20"/>
-                                    <w:szCs w:val="20"/>
-                                  </w:rPr>
-                                </w:pPr>
-                                <w:r>
-                                  <w:rPr>
-                                    <w:rFonts w:cs="Times New Roman"/>
-                                    <w:b/>
-                                    <w:color w:val="2E5090"/>
-                                    <w:sz w:val="32"/>
-                                  </w:rPr>
-                                  <w:t>Document Version: 1.0 | Duration: 2-3 weeks | Difficulty: Intermediate</w:t>
-                                </w:r>
-                              </w:p>
-                              <w:p>
-                                <w:pPr>
-                                  <w:pStyle w:val="NoSpacing"/>
-                                  <w:jc w:val="right"/>
-                                  <w:rPr>
-                                    <w:color w:val="595959" w:themeColor="text1" w:themeTint="A6"/>
-                                    <w:sz w:val="20"/>
-                                    <w:szCs w:val="20"/>
-                                  </w:rPr>
-                                </w:pPr>
-                              </w:p>
-                            </w:txbxContent>
-                          </wps:txbx>
-                          <wps:bodyPr rot="0" spcFirstLastPara="0" vertOverflow="overflow" horzOverflow="overflow" vert="horz" wrap="square" lIns="1600200" tIns="0" rIns="685800" bIns="0" numCol="1" spcCol="0" rtlCol="0" fromWordArt="0" anchor="t" anchorCtr="0" forceAA="0" compatLnSpc="1">
-                            <a:prstTxWarp prst="textNoShape">
-                              <a:avLst/>
-                            </a:prstTxWarp>
-                            <a:noAutofit/>
-                          </wps:bodyPr>
-                        </wps:wsp>
-                      </a:graphicData>
-                    </a:graphic>
-                    <wp14:sizeRelH relativeFrom="page">
-                      <wp14:pctWidth>0</wp14:pctWidth>
-                    </wp14:sizeRelH>
-                    <wp14:sizeRelV relativeFrom="page">
-                      <wp14:pctHeight>0</wp14:pctHeight>
-                    </wp14:sizeRelV>
-                  </wp:anchor>
-                </w:drawing>
-              </mc:Choice>
-              <mc:Fallback>
-                <w:pict>
-                  <v:shape w14:anchorId="512A71F1" id="Text Box 161" o:spid="_x0000_s1028" type="#_x0000_t202" style="position:absolute;margin-left:39.35pt;margin-top:583.35pt;width:538.2pt;height:45.55pt;z-index:251661312;visibility:visible;mso-wrap-style:square;mso-width-percent:0;mso-height-percent:0;mso-wrap-distance-left:9pt;mso-wrap-distance-top:0;mso-wrap-distance-right:9pt;mso-wrap-distance-bottom:0;mso-position-horizontal:absolute;mso-position-horizontal-relative:page;mso-position-vertical:absolute;mso-position-vertical-relative:page;mso-width-percent:0;mso-height-percent:0;mso-width-relative:page;mso-height-relative:page;v-text-anchor:top" o:gfxdata="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" filled="f" stroked="f" strokeweight=".5pt">
-                    <v:textbox inset="126pt,0,54pt,0">
-                      <w:txbxContent>
-                        <w:p>
-                          <w:pPr>
-                            <w:pStyle w:val="NoSpacing"/>
-                            <w:jc w:val="right"/>
-                            <w:rPr>
-                              <w:color w:val="595959" w:themeColor="text1" w:themeTint="A6"/>
-                              <w:sz w:val="20"/>
-                              <w:szCs w:val="20"/>
-                            </w:rPr>
-                          </w:pPr>
-                          <w:r>
-                            <w:rPr>
-                              <w:rFonts w:cs="Times New Roman"/>
-                              <w:b/>
-                              <w:color w:val="2E5090"/>
-                              <w:sz w:val="32"/>
-                            </w:rPr>
-                            <w:t>Document Version: 1.0 | Duration: 2-3 weeks | Difficulty: Intermediate</w:t>
-                          </w:r>
-                        </w:p>
-                        <w:p>
-                          <w:pPr>
-                            <w:pStyle w:val="NoSpacing"/>
-                            <w:jc w:val="right"/>
-                            <w:rPr>
-                              <w:color w:val="595959" w:themeColor="text1" w:themeTint="A6"/>
-                              <w:sz w:val="20"/>
-                              <w:szCs w:val="20"/>
-                            </w:rPr>
-                          </w:pPr>
-                        </w:p>
-                      </w:txbxContent>
-                    </v:textbox>
-                    <w10:wrap type="square" anchorx="page" anchory="page"/>
+                    <w10:wrap type="square" anchorx="margin" anchory="page"/>
                   </v:shape>
                 </w:pict>
               </mc:Fallback>

</xml_diff>